<commit_message>
Exécution des exercices dans packet tracer
</commit_message>
<xml_diff>
--- a/RESEAU_LOCAL_ET_SECURITE/Cours11/420-2C5-JR_11_Débogage/420-2C5-JR_11_Debogage.docx
+++ b/RESEAU_LOCAL_ET_SECURITE/Cours11/420-2C5-JR_11_Débogage/420-2C5-JR_11_Debogage.docx
@@ -1655,6 +1655,15 @@
       <w:r>
         <w:t xml:space="preserve"> </w:t>
       </w:r>
+      <w:r>
+        <w:t>PC0 était mal configuré (19</w:t>
+      </w:r>
+      <w:r>
+        <w:t>8</w:t>
+      </w:r>
+      <w:r>
+        <w:t>.162.1.100)</w:t>
+      </w:r>
     </w:p>
     <w:bookmarkEnd w:id="0"/>
     <w:p>
@@ -1687,6 +1696,12 @@
       </w:r>
       <w:r>
         <w:t xml:space="preserve"> </w:t>
+      </w:r>
+      <w:r>
+        <w:t xml:space="preserve"> configuration du PC avec l’adresse </w:t>
+      </w:r>
+      <w:r>
+        <w:t>192.168.1.100</w:t>
       </w:r>
     </w:p>
     <w:p>
@@ -1746,6 +1761,9 @@
       <w:r>
         <w:t xml:space="preserve"> </w:t>
       </w:r>
+      <w:r>
+        <w:t>mauvais subnetmask du PC0</w:t>
+      </w:r>
     </w:p>
     <w:p>
       <w:pPr>
@@ -1777,6 +1795,9 @@
       </w:r>
       <w:r>
         <w:t xml:space="preserve"> </w:t>
+      </w:r>
+      <w:r>
+        <w:t xml:space="preserve"> mettre le subnetmask du PC0 à 255.255.255.0</w:t>
       </w:r>
     </w:p>
     <w:p>
@@ -1850,6 +1871,9 @@
       <w:r>
         <w:t xml:space="preserve"> </w:t>
       </w:r>
+      <w:r>
+        <w:t>PC0 n’était en DHCP, et pas connecté avec le bon cable</w:t>
+      </w:r>
     </w:p>
     <w:p>
       <w:pPr>
@@ -1882,6 +1906,9 @@
       <w:r>
         <w:t xml:space="preserve"> </w:t>
       </w:r>
+      <w:r>
+        <w:t>Mettre le PC en DHCP et le connecter avec le cable Gigabitethernet 2 au routeur</w:t>
+      </w:r>
     </w:p>
     <w:p>
       <w:pPr>
@@ -1906,6 +1933,110 @@
       </w:pPr>
       <w:r>
         <w:t>Il semble qu’un des PC a toujours de la difficulté à communiquer avec le serveur web, cela semble changer à chaque démarrage du réseau.</w:t>
+      </w:r>
+    </w:p>
+    <w:p>
+      <w:pPr>
+        <w:pBdr>
+          <w:top w:val="single" w:sz="4" w:space="1" w:color="auto"/>
+          <w:left w:val="single" w:sz="4" w:space="4" w:color="auto"/>
+          <w:bottom w:val="single" w:sz="4" w:space="1" w:color="auto"/>
+          <w:right w:val="single" w:sz="4" w:space="4" w:color="auto"/>
+        </w:pBdr>
+        <w:tabs>
+          <w:tab w:val="left" w:pos="990"/>
+          <w:tab w:val="left" w:pos="1260"/>
+        </w:tabs>
+      </w:pPr>
+      <w:r>
+        <w:rPr>
+          <w:b/>
+          <w:bCs/>
+        </w:rPr>
+        <w:t>Explication</w:t>
+      </w:r>
+      <w:r>
+        <w:rPr>
+          <w:b/>
+          <w:bCs/>
+        </w:rPr>
+        <w:tab/>
+        <w:t>:</w:t>
+      </w:r>
+      <w:r>
+        <w:t xml:space="preserve"> </w:t>
+      </w:r>
+      <w:r>
+        <w:t>le PC2 n'était pas en DHCP</w:t>
+      </w:r>
+      <w:r>
+        <w:t xml:space="preserve"> </w:t>
+      </w:r>
+      <w:r>
+        <w:t>Le routeur pouvait juste donner accès au DHCP</w:t>
+      </w:r>
+    </w:p>
+    <w:p>
+      <w:pPr>
+        <w:pBdr>
+          <w:top w:val="single" w:sz="4" w:space="1" w:color="auto"/>
+          <w:left w:val="single" w:sz="4" w:space="4" w:color="auto"/>
+          <w:bottom w:val="single" w:sz="4" w:space="1" w:color="auto"/>
+          <w:right w:val="single" w:sz="4" w:space="4" w:color="auto"/>
+        </w:pBdr>
+        <w:tabs>
+          <w:tab w:val="left" w:pos="990"/>
+          <w:tab w:val="left" w:pos="1260"/>
+        </w:tabs>
+      </w:pPr>
+      <w:r>
+        <w:rPr>
+          <w:b/>
+          <w:bCs/>
+        </w:rPr>
+        <w:t>Solution:</w:t>
+      </w:r>
+      <w:r>
+        <w:rPr>
+          <w:b/>
+          <w:bCs/>
+        </w:rPr>
+        <w:t xml:space="preserve"> </w:t>
+      </w:r>
+      <w:r>
+        <w:rPr>
+          <w:b/>
+          <w:bCs/>
+        </w:rPr>
+        <w:t>le PC2 en DHCP, augmenter le nombre d'utilisateur sur le routeur</w:t>
+      </w:r>
+      <w:r>
+        <w:t xml:space="preserve"> </w:t>
+      </w:r>
+    </w:p>
+    <w:p>
+      <w:pPr>
+        <w:pStyle w:val="Titre2"/>
+      </w:pPr>
+      <w:r>
+        <w:t xml:space="preserve">Fichier </w:t>
+      </w:r>
+      <w:r>
+        <w:t>0</w:t>
+      </w:r>
+      <w:r>
+        <w:t>5</w:t>
+      </w:r>
+    </w:p>
+    <w:p>
+      <w:pPr>
+        <w:tabs>
+          <w:tab w:val="left" w:pos="990"/>
+        </w:tabs>
+        <w:spacing w:after="120"/>
+      </w:pPr>
+      <w:r>
+        <w:t>Les PC ne semblent pas pouvoir communiquer avec le serveur web, mais semblent pouvoir communiquer entre eux.</w:t>
       </w:r>
     </w:p>
     <w:p>
@@ -1940,6 +2071,9 @@
       <w:r>
         <w:t xml:space="preserve"> </w:t>
       </w:r>
+      <w:r>
+        <w:t>le server web n’était pas allumé, les PC n’étaient pas DHCP</w:t>
+      </w:r>
     </w:p>
     <w:p>
       <w:pPr>
@@ -1972,19 +2106,35 @@
       <w:r>
         <w:t xml:space="preserve"> </w:t>
       </w:r>
+      <w:r>
+        <w:t>Allumé le server DHCP, et mettre les PC en DHCP</w:t>
+      </w:r>
+    </w:p>
+    <w:p>
+      <w:pPr>
+        <w:jc w:val="left"/>
+        <w:rPr>
+          <w:caps/>
+          <w:spacing w:val="15"/>
+        </w:rPr>
+      </w:pPr>
+      <w:r>
+        <w:br w:type="page"/>
+      </w:r>
     </w:p>
     <w:p>
       <w:pPr>
         <w:pStyle w:val="Titre2"/>
       </w:pPr>
       <w:r>
+        <w:lastRenderedPageBreak/>
         <w:t xml:space="preserve">Fichier </w:t>
       </w:r>
       <w:r>
         <w:t>0</w:t>
       </w:r>
       <w:r>
-        <w:t>5</w:t>
+        <w:t>6</w:t>
       </w:r>
     </w:p>
     <w:p>
@@ -1995,7 +2145,7 @@
         <w:spacing w:after="120"/>
       </w:pPr>
       <w:r>
-        <w:t>Les PC ne semblent pas pouvoir communiquer avec le serveur web, mais semblent pouvoir communiquer entre eux.</w:t>
+        <w:t>Le PC0 semble pouvoir communiquer avec le PC1, mais pas avec le PC2. Cependant, le PC2 semble pouvoir communiquer avec le PC3.</w:t>
       </w:r>
     </w:p>
     <w:p>
@@ -2030,6 +2180,9 @@
       <w:r>
         <w:t xml:space="preserve"> </w:t>
       </w:r>
+      <w:r>
+        <w:t>PC2 n’avais pas le bon gateway</w:t>
+      </w:r>
     </w:p>
     <w:p>
       <w:pPr>
@@ -2062,17 +2215,11 @@
       <w:r>
         <w:t xml:space="preserve"> </w:t>
       </w:r>
-    </w:p>
-    <w:p>
-      <w:pPr>
-        <w:jc w:val="left"/>
-        <w:rPr>
-          <w:caps/>
-          <w:spacing w:val="15"/>
-        </w:rPr>
-      </w:pPr>
-      <w:r>
-        <w:br w:type="page"/>
+      <w:r>
+        <w:t>mettre le bon gateway</w:t>
+      </w:r>
+      <w:r>
+        <w:t xml:space="preserve"> 192.168.10.1</w:t>
       </w:r>
     </w:p>
     <w:p>
@@ -2080,14 +2227,13 @@
         <w:pStyle w:val="Titre2"/>
       </w:pPr>
       <w:r>
-        <w:lastRenderedPageBreak/>
         <w:t xml:space="preserve">Fichier </w:t>
       </w:r>
       <w:r>
         <w:t>0</w:t>
       </w:r>
       <w:r>
-        <w:t>6</w:t>
+        <w:t>7</w:t>
       </w:r>
     </w:p>
     <w:p>
@@ -2098,7 +2244,7 @@
         <w:spacing w:after="120"/>
       </w:pPr>
       <w:r>
-        <w:t>Le PC0 semble pouvoir communiquer avec le PC1, mais pas avec le PC2. Cependant, le PC2 semble pouvoir communiquer avec le PC3.</w:t>
+        <w:t>Les PC ne semblent pas pouvoir communiquer avec le serveur web.</w:t>
       </w:r>
     </w:p>
     <w:p>
@@ -2133,6 +2279,9 @@
       <w:r>
         <w:t xml:space="preserve"> </w:t>
       </w:r>
+      <w:r>
+        <w:t>le server DHCP n’offrait pas de gateway</w:t>
+      </w:r>
     </w:p>
     <w:p>
       <w:pPr>
@@ -2165,6 +2314,9 @@
       <w:r>
         <w:t xml:space="preserve"> </w:t>
       </w:r>
+      <w:r>
+        <w:t>mettre à jour le gateway avec cette adresse : 192.168.10.1</w:t>
+      </w:r>
     </w:p>
     <w:p>
       <w:pPr>
@@ -2177,7 +2329,7 @@
         <w:t>0</w:t>
       </w:r>
       <w:r>
-        <w:t>7</w:t>
+        <w:t>8</w:t>
       </w:r>
     </w:p>
     <w:p>
@@ -2188,7 +2340,25 @@
         <w:spacing w:after="120"/>
       </w:pPr>
       <w:r>
-        <w:t>Les PC ne semblent pas pouvoir communiquer avec le serveur web.</w:t>
+        <w:t xml:space="preserve">Les PC ne semblent pas pouvoir accéder au site web </w:t>
+      </w:r>
+      <w:r>
+        <w:rPr>
+          <w:rStyle w:val="CodeCar"/>
+        </w:rPr>
+        <w:t>admin.omnivox.com</w:t>
+      </w:r>
+      <w:r>
+        <w:t xml:space="preserve">, mais </w:t>
+      </w:r>
+      <w:r>
+        <w:rPr>
+          <w:rStyle w:val="CodeCar"/>
+        </w:rPr>
+        <w:t>mail.omnivox.com</w:t>
+      </w:r>
+      <w:r>
+        <w:t xml:space="preserve"> semble fonctionner.</w:t>
       </w:r>
     </w:p>
     <w:p>
@@ -2223,6 +2393,12 @@
       <w:r>
         <w:t xml:space="preserve"> </w:t>
       </w:r>
+      <w:r>
+        <w:t>l’adresse IP du serverweb est mal configuré dans le server dns</w:t>
+      </w:r>
+      <w:r>
+        <w:t>, l’adresse A record ne correspond pas avec l’adresse du serverWeb</w:t>
+      </w:r>
     </w:p>
     <w:p>
       <w:pPr>
@@ -2255,113 +2431,8 @@
       <w:r>
         <w:t xml:space="preserve"> </w:t>
       </w:r>
-    </w:p>
-    <w:p>
-      <w:pPr>
-        <w:pStyle w:val="Titre2"/>
-      </w:pPr>
-      <w:r>
-        <w:t xml:space="preserve">Fichier </w:t>
-      </w:r>
-      <w:r>
-        <w:t>0</w:t>
-      </w:r>
-      <w:r>
-        <w:t>8</w:t>
-      </w:r>
-    </w:p>
-    <w:p>
-      <w:pPr>
-        <w:tabs>
-          <w:tab w:val="left" w:pos="990"/>
-        </w:tabs>
-        <w:spacing w:after="120"/>
-      </w:pPr>
-      <w:r>
-        <w:t xml:space="preserve">Les PC ne semblent pas pouvoir accéder au site web </w:t>
-      </w:r>
-      <w:r>
-        <w:rPr>
-          <w:rStyle w:val="CodeCar"/>
-        </w:rPr>
-        <w:t>admin.omnivox.com</w:t>
-      </w:r>
-      <w:r>
-        <w:t xml:space="preserve">, mais </w:t>
-      </w:r>
-      <w:r>
-        <w:rPr>
-          <w:rStyle w:val="CodeCar"/>
-        </w:rPr>
-        <w:t>mail.omnivox.com</w:t>
-      </w:r>
-      <w:r>
-        <w:t xml:space="preserve"> semble fonctionner.</w:t>
-      </w:r>
-    </w:p>
-    <w:p>
-      <w:pPr>
-        <w:pBdr>
-          <w:top w:val="single" w:sz="4" w:space="1" w:color="auto"/>
-          <w:left w:val="single" w:sz="4" w:space="4" w:color="auto"/>
-          <w:bottom w:val="single" w:sz="4" w:space="1" w:color="auto"/>
-          <w:right w:val="single" w:sz="4" w:space="4" w:color="auto"/>
-        </w:pBdr>
-        <w:tabs>
-          <w:tab w:val="left" w:pos="990"/>
-          <w:tab w:val="left" w:pos="1260"/>
-        </w:tabs>
-        <w:spacing w:after="0"/>
-      </w:pPr>
-      <w:r>
-        <w:rPr>
-          <w:b/>
-          <w:bCs/>
-        </w:rPr>
-        <w:t>Explication</w:t>
-      </w:r>
-      <w:r>
-        <w:rPr>
-          <w:b/>
-          <w:bCs/>
-        </w:rPr>
-        <w:tab/>
-        <w:t>:</w:t>
-      </w:r>
-      <w:r>
-        <w:t xml:space="preserve"> </w:t>
-      </w:r>
-    </w:p>
-    <w:p>
-      <w:pPr>
-        <w:pBdr>
-          <w:top w:val="single" w:sz="4" w:space="1" w:color="auto"/>
-          <w:left w:val="single" w:sz="4" w:space="4" w:color="auto"/>
-          <w:bottom w:val="single" w:sz="4" w:space="1" w:color="auto"/>
-          <w:right w:val="single" w:sz="4" w:space="4" w:color="auto"/>
-        </w:pBdr>
-        <w:tabs>
-          <w:tab w:val="left" w:pos="990"/>
-          <w:tab w:val="left" w:pos="1260"/>
-        </w:tabs>
-      </w:pPr>
-      <w:r>
-        <w:rPr>
-          <w:b/>
-          <w:bCs/>
-        </w:rPr>
-        <w:t>Solution</w:t>
-      </w:r>
-      <w:r>
-        <w:rPr>
-          <w:b/>
-          <w:bCs/>
-        </w:rPr>
-        <w:tab/>
-        <w:t>:</w:t>
-      </w:r>
-      <w:r>
-        <w:t xml:space="preserve"> </w:t>
+      <w:r>
+        <w:t xml:space="preserve"> Changer l’adresse du serverWeb A record pour 192.168.10.4</w:t>
       </w:r>
     </w:p>
     <w:p>
@@ -7653,7 +7724,6 @@
   <w:style w:type="character" w:default="1" w:styleId="Policepardfaut">
     <w:name w:val="Default Paragraph Font"/>
     <w:uiPriority w:val="1"/>
-    <w:semiHidden/>
     <w:unhideWhenUsed/>
   </w:style>
   <w:style w:type="table" w:default="1" w:styleId="TableauNormal">
@@ -8541,6 +8611,19 @@
       <w:spacing w:before="0" w:after="0" w:line="240" w:lineRule="auto"/>
     </w:pPr>
   </w:style>
+  <w:style w:type="paragraph" w:styleId="NormalWeb">
+    <w:name w:val="Normal (Web)"/>
+    <w:basedOn w:val="Normal"/>
+    <w:uiPriority w:val="99"/>
+    <w:semiHidden/>
+    <w:unhideWhenUsed/>
+    <w:rsid w:val="00E02298"/>
+    <w:rPr>
+      <w:rFonts w:ascii="Times New Roman" w:hAnsi="Times New Roman" w:cs="Times New Roman"/>
+      <w:sz w:val="24"/>
+      <w:szCs w:val="24"/>
+    </w:rPr>
+  </w:style>
 </w:styles>
 </file>
 
@@ -8840,10 +8923,21 @@
 </file>
 
 <file path=customXml/item1.xml><?xml version="1.0" encoding="utf-8"?>
-<b:Sources xmlns:b="http://schemas.openxmlformats.org/officeDocument/2006/bibliography" xmlns="http://schemas.openxmlformats.org/officeDocument/2006/bibliography" SelectedStyle="\APASixthEditionOfficeOnline.xsl" StyleName="APA" Version="6"/>
+<p:properties xmlns:p="http://schemas.microsoft.com/office/2006/metadata/properties" xmlns:xsi="http://www.w3.org/2001/XMLSchema-instance" xmlns:pc="http://schemas.microsoft.com/office/infopath/2007/PartnerControls">
+  <documentManagement/>
+</p:properties>
 </file>
 
 <file path=customXml/item2.xml><?xml version="1.0" encoding="utf-8"?>
+<?mso-contentType ?>
+<FormTemplates xmlns="http://schemas.microsoft.com/sharepoint/v3/contenttype/forms">
+  <Display>DocumentLibraryForm</Display>
+  <Edit>DocumentLibraryForm</Edit>
+  <New>DocumentLibraryForm</New>
+</FormTemplates>
+</file>
+
+<file path=customXml/item3.xml><?xml version="1.0" encoding="utf-8"?>
 <ct:contentTypeSchema xmlns:ct="http://schemas.microsoft.com/office/2006/metadata/contentType" xmlns:ma="http://schemas.microsoft.com/office/2006/metadata/properties/metaAttributes" ct:_="" ma:_="" ma:contentTypeName="Document" ma:contentTypeID="0x0101002DD630CBD3BB3F4F95EEEAB2D4B8EF6D" ma:contentTypeVersion="2" ma:contentTypeDescription="Crée un document." ma:contentTypeScope="" ma:versionID="ce2073649f6bbdf3db2abbc034688be1">
   <xsd:schema xmlns:xsd="http://www.w3.org/2001/XMLSchema" xmlns:xs="http://www.w3.org/2001/XMLSchema" xmlns:p="http://schemas.microsoft.com/office/2006/metadata/properties" xmlns:ns2="d4bb1648-9185-4a93-8a04-803fbfedaf8e" targetNamespace="http://schemas.microsoft.com/office/2006/metadata/properties" ma:root="true" ma:fieldsID="dd5e294b257df46920c8d546fe124cea" ns2:_="">
     <xsd:import namespace="d4bb1648-9185-4a93-8a04-803fbfedaf8e"/>
@@ -8975,30 +9069,28 @@
 </ct:contentTypeSchema>
 </file>
 
-<file path=customXml/item3.xml><?xml version="1.0" encoding="utf-8"?>
-<?mso-contentType ?>
-<FormTemplates xmlns="http://schemas.microsoft.com/sharepoint/v3/contenttype/forms">
-  <Display>DocumentLibraryForm</Display>
-  <Edit>DocumentLibraryForm</Edit>
-  <New>DocumentLibraryForm</New>
-</FormTemplates>
-</file>
-
 <file path=customXml/item4.xml><?xml version="1.0" encoding="utf-8"?>
-<p:properties xmlns:p="http://schemas.microsoft.com/office/2006/metadata/properties" xmlns:xsi="http://www.w3.org/2001/XMLSchema-instance" xmlns:pc="http://schemas.microsoft.com/office/infopath/2007/PartnerControls">
-  <documentManagement/>
-</p:properties>
+<b:Sources xmlns:b="http://schemas.openxmlformats.org/officeDocument/2006/bibliography" xmlns="http://schemas.openxmlformats.org/officeDocument/2006/bibliography" SelectedStyle="\APASixthEditionOfficeOnline.xsl" StyleName="APA" Version="6"/>
 </file>
 
 <file path=customXml/itemProps1.xml><?xml version="1.0" encoding="utf-8"?>
-<ds:datastoreItem xmlns:ds="http://schemas.openxmlformats.org/officeDocument/2006/customXml" ds:itemID="{20730C14-5559-4816-8D2F-267CB32F4239}">
+<ds:datastoreItem xmlns:ds="http://schemas.openxmlformats.org/officeDocument/2006/customXml" ds:itemID="{B1A0529D-107D-48F2-9C7A-C9B0532E61D6}">
   <ds:schemaRefs>
-    <ds:schemaRef ds:uri="http://schemas.openxmlformats.org/officeDocument/2006/bibliography"/>
+    <ds:schemaRef ds:uri="http://schemas.microsoft.com/office/2006/metadata/properties"/>
+    <ds:schemaRef ds:uri="http://schemas.microsoft.com/office/infopath/2007/PartnerControls"/>
   </ds:schemaRefs>
 </ds:datastoreItem>
 </file>
 
 <file path=customXml/itemProps2.xml><?xml version="1.0" encoding="utf-8"?>
+<ds:datastoreItem xmlns:ds="http://schemas.openxmlformats.org/officeDocument/2006/customXml" ds:itemID="{5991A026-0A3A-4A40-9DFB-B1FAB829B1E8}">
+  <ds:schemaRefs>
+    <ds:schemaRef ds:uri="http://schemas.microsoft.com/sharepoint/v3/contenttype/forms"/>
+  </ds:schemaRefs>
+</ds:datastoreItem>
+</file>
+
+<file path=customXml/itemProps3.xml><?xml version="1.0" encoding="utf-8"?>
 <ds:datastoreItem xmlns:ds="http://schemas.openxmlformats.org/officeDocument/2006/customXml" ds:itemID="{3FC0CD1C-8210-47B9-B60B-16B5804313E0}">
   <ds:schemaRefs>
     <ds:schemaRef ds:uri="http://schemas.microsoft.com/office/2006/metadata/contentType"/>
@@ -9016,19 +9108,10 @@
 </ds:datastoreItem>
 </file>
 
-<file path=customXml/itemProps3.xml><?xml version="1.0" encoding="utf-8"?>
-<ds:datastoreItem xmlns:ds="http://schemas.openxmlformats.org/officeDocument/2006/customXml" ds:itemID="{5991A026-0A3A-4A40-9DFB-B1FAB829B1E8}">
+<file path=customXml/itemProps4.xml><?xml version="1.0" encoding="utf-8"?>
+<ds:datastoreItem xmlns:ds="http://schemas.openxmlformats.org/officeDocument/2006/customXml" ds:itemID="{20730C14-5559-4816-8D2F-267CB32F4239}">
   <ds:schemaRefs>
-    <ds:schemaRef ds:uri="http://schemas.microsoft.com/sharepoint/v3/contenttype/forms"/>
-  </ds:schemaRefs>
-</ds:datastoreItem>
-</file>
-
-<file path=customXml/itemProps4.xml><?xml version="1.0" encoding="utf-8"?>
-<ds:datastoreItem xmlns:ds="http://schemas.openxmlformats.org/officeDocument/2006/customXml" ds:itemID="{B1A0529D-107D-48F2-9C7A-C9B0532E61D6}">
-  <ds:schemaRefs>
-    <ds:schemaRef ds:uri="http://schemas.microsoft.com/office/2006/metadata/properties"/>
-    <ds:schemaRef ds:uri="http://schemas.microsoft.com/office/infopath/2007/PartnerControls"/>
+    <ds:schemaRef ds:uri="http://schemas.openxmlformats.org/officeDocument/2006/bibliography"/>
   </ds:schemaRefs>
 </ds:datastoreItem>
 </file>
</xml_diff>

<commit_message>
Faire le zip du TP partie A
</commit_message>
<xml_diff>
--- a/RESEAU_LOCAL_ET_SECURITE/Cours11/420-2C5-JR_11_Débogage/420-2C5-JR_11_Debogage.docx
+++ b/RESEAU_LOCAL_ET_SECURITE/Cours11/420-2C5-JR_11_Débogage/420-2C5-JR_11_Debogage.docx
@@ -1762,7 +1762,15 @@
         <w:t xml:space="preserve"> </w:t>
       </w:r>
       <w:r>
-        <w:t>mauvais subnetmask du PC0</w:t>
+        <w:t xml:space="preserve">mauvais </w:t>
+      </w:r>
+      <w:proofErr w:type="spellStart"/>
+      <w:r>
+        <w:t>subnetmask</w:t>
+      </w:r>
+      <w:proofErr w:type="spellEnd"/>
+      <w:r>
+        <w:t xml:space="preserve"> du PC0</w:t>
       </w:r>
     </w:p>
     <w:p>
@@ -1797,7 +1805,15 @@
         <w:t xml:space="preserve"> </w:t>
       </w:r>
       <w:r>
-        <w:t xml:space="preserve"> mettre le subnetmask du PC0 à 255.255.255.0</w:t>
+        <w:t xml:space="preserve"> mettre le </w:t>
+      </w:r>
+      <w:proofErr w:type="spellStart"/>
+      <w:r>
+        <w:t>subnetmask</w:t>
+      </w:r>
+      <w:proofErr w:type="spellEnd"/>
+      <w:r>
+        <w:t xml:space="preserve"> du PC0 à 255.255.255.0</w:t>
       </w:r>
     </w:p>
     <w:p>
@@ -1872,8 +1888,13 @@
         <w:t xml:space="preserve"> </w:t>
       </w:r>
       <w:r>
-        <w:t>PC0 n’était en DHCP, et pas connecté avec le bon cable</w:t>
-      </w:r>
+        <w:t xml:space="preserve">PC0 n’était en DHCP, et pas connecté avec le bon </w:t>
+      </w:r>
+      <w:proofErr w:type="spellStart"/>
+      <w:r>
+        <w:t>cable</w:t>
+      </w:r>
+      <w:proofErr w:type="spellEnd"/>
     </w:p>
     <w:p>
       <w:pPr>
@@ -1907,7 +1928,23 @@
         <w:t xml:space="preserve"> </w:t>
       </w:r>
       <w:r>
-        <w:t>Mettre le PC en DHCP et le connecter avec le cable Gigabitethernet 2 au routeur</w:t>
+        <w:t xml:space="preserve">Mettre le PC en DHCP et le connecter avec le </w:t>
+      </w:r>
+      <w:proofErr w:type="spellStart"/>
+      <w:r>
+        <w:t>cable</w:t>
+      </w:r>
+      <w:proofErr w:type="spellEnd"/>
+      <w:r>
+        <w:t xml:space="preserve"> </w:t>
+      </w:r>
+      <w:proofErr w:type="spellStart"/>
+      <w:r>
+        <w:t>Gigabitethernet</w:t>
+      </w:r>
+      <w:proofErr w:type="spellEnd"/>
+      <w:r>
+        <w:t xml:space="preserve"> 2 au routeur</w:t>
       </w:r>
     </w:p>
     <w:p>
@@ -2181,8 +2218,13 @@
         <w:t xml:space="preserve"> </w:t>
       </w:r>
       <w:r>
-        <w:t>PC2 n’avais pas le bon gateway</w:t>
-      </w:r>
+        <w:t xml:space="preserve">PC2 n’avais pas le bon </w:t>
+      </w:r>
+      <w:proofErr w:type="spellStart"/>
+      <w:r>
+        <w:t>gateway</w:t>
+      </w:r>
+      <w:proofErr w:type="spellEnd"/>
     </w:p>
     <w:p>
       <w:pPr>
@@ -2216,8 +2258,13 @@
         <w:t xml:space="preserve"> </w:t>
       </w:r>
       <w:r>
-        <w:t>mettre le bon gateway</w:t>
-      </w:r>
+        <w:t xml:space="preserve">mettre le bon </w:t>
+      </w:r>
+      <w:proofErr w:type="spellStart"/>
+      <w:r>
+        <w:t>gateway</w:t>
+      </w:r>
+      <w:proofErr w:type="spellEnd"/>
       <w:r>
         <w:t xml:space="preserve"> 192.168.10.1</w:t>
       </w:r>
@@ -2280,8 +2327,13 @@
         <w:t xml:space="preserve"> </w:t>
       </w:r>
       <w:r>
-        <w:t>le server DHCP n’offrait pas de gateway</w:t>
-      </w:r>
+        <w:t xml:space="preserve">le server DHCP n’offrait pas de </w:t>
+      </w:r>
+      <w:proofErr w:type="spellStart"/>
+      <w:r>
+        <w:t>gateway</w:t>
+      </w:r>
+      <w:proofErr w:type="spellEnd"/>
     </w:p>
     <w:p>
       <w:pPr>
@@ -2315,7 +2367,15 @@
         <w:t xml:space="preserve"> </w:t>
       </w:r>
       <w:r>
-        <w:t>mettre à jour le gateway avec cette adresse : 192.168.10.1</w:t>
+        <w:t xml:space="preserve">mettre à jour le </w:t>
+      </w:r>
+      <w:proofErr w:type="spellStart"/>
+      <w:r>
+        <w:t>gateway</w:t>
+      </w:r>
+      <w:proofErr w:type="spellEnd"/>
+      <w:r>
+        <w:t xml:space="preserve"> avec cette adresse : 192.168.10.1</w:t>
       </w:r>
     </w:p>
     <w:p>
@@ -2394,11 +2454,29 @@
         <w:t xml:space="preserve"> </w:t>
       </w:r>
       <w:r>
-        <w:t>l’adresse IP du serverweb est mal configuré dans le server dns</w:t>
-      </w:r>
-      <w:r>
-        <w:t>, l’adresse A record ne correspond pas avec l’adresse du serverWeb</w:t>
-      </w:r>
+        <w:t xml:space="preserve">l’adresse IP du </w:t>
+      </w:r>
+      <w:proofErr w:type="spellStart"/>
+      <w:r>
+        <w:t>serverweb</w:t>
+      </w:r>
+      <w:proofErr w:type="spellEnd"/>
+      <w:r>
+        <w:t xml:space="preserve"> est mal configuré dans le server </w:t>
+      </w:r>
+      <w:proofErr w:type="spellStart"/>
+      <w:r>
+        <w:t>dns</w:t>
+      </w:r>
+      <w:proofErr w:type="spellEnd"/>
+      <w:r>
+        <w:t xml:space="preserve">, l’adresse A record ne correspond pas avec l’adresse du </w:t>
+      </w:r>
+      <w:proofErr w:type="spellStart"/>
+      <w:r>
+        <w:t>serverWeb</w:t>
+      </w:r>
+      <w:proofErr w:type="spellEnd"/>
     </w:p>
     <w:p>
       <w:pPr>
@@ -2432,7 +2510,15 @@
         <w:t xml:space="preserve"> </w:t>
       </w:r>
       <w:r>
-        <w:t xml:space="preserve"> Changer l’adresse du serverWeb A record pour 192.168.10.4</w:t>
+        <w:t xml:space="preserve"> Changer l’adresse du </w:t>
+      </w:r>
+      <w:proofErr w:type="spellStart"/>
+      <w:r>
+        <w:t>serverWeb</w:t>
+      </w:r>
+      <w:proofErr w:type="spellEnd"/>
+      <w:r>
+        <w:t xml:space="preserve"> A record pour 192.168.10.4</w:t>
       </w:r>
     </w:p>
     <w:p>
@@ -2507,6 +2593,9 @@
       <w:r>
         <w:t xml:space="preserve"> </w:t>
       </w:r>
+      <w:r>
+        <w:t>Le server DHCP n’offrait pas le DNS aux PC</w:t>
+      </w:r>
     </w:p>
     <w:p>
       <w:pPr>
@@ -2538,6 +2627,17 @@
       </w:r>
       <w:r>
         <w:t xml:space="preserve"> </w:t>
+      </w:r>
+      <w:r>
+        <w:t xml:space="preserve">Configurer le server DHCP pour que les PC </w:t>
+      </w:r>
+      <w:proofErr w:type="gramStart"/>
+      <w:r>
+        <w:t>aient  accès</w:t>
+      </w:r>
+      <w:proofErr w:type="gramEnd"/>
+      <w:r>
+        <w:t xml:space="preserve"> au DNS</w:t>
       </w:r>
     </w:p>
     <w:p>

</xml_diff>